<commit_message>
Reescrita - Notebooks e Revisão
</commit_message>
<xml_diff>
--- a/docs/projeto_tcc_agro_rev1.docx
+++ b/docs/projeto_tcc_agro_rev1.docx
@@ -873,7 +873,7 @@
       <w:commentRangeStart w:id="0"/>
       <w:ins w:id="9002" w:author="Claude" w:date="2026-10-19T12:00:00Z">
         <w:r>
-          <w:t xml:space="preserve">A escolha do agronegócio como objeto de estudo não é casual. O setor responde por cerca de um quarto do PIB brasileiro e por perto de metade das exportações do país, e suas empresas estão expostas ao mesmo tempo a três fontes de risco que se influenciam: o preço internacional das commodities, negociadas em dólar nas bolsas de Chicago (CBOT) e de Nova York (ICE); a taxa de câmbio, que converte esse preço em receita em reais; e o próprio ciclo do mercado acionário brasileiro. Choques climáticos, safras recordes ou frustradas, mudanças na demanda chinesa e crises cambiais podem alterar de forma abrupta o comportamento conjunto desses ativos, que é exatamente o tipo de mudança que um modelo de regimes procura capturar.</w:t>
+          <w:t xml:space="preserve">O agronegócio foi escolhido por sua relevância econômica e pela diversidade de suas exposições ao risco. O setor responde por cerca de um quarto do PIB brasileiro e por perto de metade das exportações do país, e suas empresas estão expostas ao mesmo tempo a três fontes de risco que se influenciam: o preço internacional das commodities, negociadas em dólar nas bolsas de Chicago (CBOT) e de Nova York (ICE); a taxa de câmbio, que converte esse preço em receita em reais; e o próprio ciclo do mercado acionário brasileiro. Choques climáticos, safras recordes ou frustradas, mudanças na demanda chinesa e crises cambiais podem alterar de forma abrupta o comportamento conjunto desses ativos, que é exatamente o tipo de mudança que um modelo de regimes procura capturar.</w:t>
         </w:r>
       </w:ins>
       <w:commentRangeEnd w:id="0"/>
@@ -1241,7 +1241,7 @@
       </w:del>
       <w:ins w:id="9032" w:author="Claude" w:date="2026-10-19T12:00:00Z">
         <w:r>
-          <w:t xml:space="preserve">A pesquisa se justifica em três dimensões: técnico-científica, prático-regulatória e econômico-social. Do ponto de vista técnico-científico, a literatura recente em finanças quantitativas mostra que modelos híbridos, que combinam econometria clássica e aprendizado de máquina, superam abordagens isoladas na previsão de retornos e volatilidades (RABBANI et al., 2025; SARKAR, 2025). Ainda assim, o uso explícito de modelos de mudança de regime como condicionante da previsão de deep learning segue pouco explorado, sobretudo em carteiras brasileiras com vários ativos e, até onde se pôde verificar, em carteiras do agronegócio. Este trabalho procura contribuir para preencher essa lacuna com uma arquitetura unificada e replicável.</w:t>
+          <w:t xml:space="preserve">Na dimensão técnico-científica, a literatura recente em finanças quantitativas mostra que modelos híbridos, que combinam econometria clássica e aprendizado de máquina, superam abordagens isoladas na previsão de retornos e volatilidades (RABBANI et al., 2025; SARKAR, 2025). Ainda assim, o uso explícito de modelos de mudança de regime como condicionante da previsão de deep learning segue pouco explorado, sobretudo em carteiras brasileiras com vários ativos e, até onde se pôde verificar, em carteiras do agronegócio. Este trabalho procura contribuir para preencher essa lacuna com uma arquitetura unificada e replicável.</w:t>
         </w:r>
       </w:ins>
     </w:p>
@@ -1261,7 +1261,7 @@
       <w:commentRangeStart w:id="1"/>
       <w:ins w:id="9034" w:author="Claude" w:date="2026-10-19T12:00:00Z">
         <w:r>
-          <w:t xml:space="preserve">Do ponto de vista prático-regulatório, a Resolução CMN n.º 4.557/2017 obriga as instituições financeiras a manter uma gestão integrada de riscos, em linha com Basileia III, que vem substituindo gradualmente o VaR pelo Expected Shortfall como medida regulatória de risco de mercado. Modelos mais precisos em períodos de estresse permitem uma alocação de capital mais adequada e contribuem para a estabilidade financeira. Episódios recentes mostram essa necessidade. No choque da pandemia de COVID-19, o dólar subiu quase 50% frente ao real entre o início de 2020 e maio do mesmo ano. Entre meados de 2020 e meados de 2022, o preço internacional da soja mais que dobrou, com efeitos diretos sobre a receita e o risco das empresas do setor.</w:t>
+          <w:t xml:space="preserve">Quanto à aplicação prática, a Resolução CMN n.º 4.557/2017 obriga as instituições financeiras a manter uma gestão integrada de riscos, em linha com Basileia III, que vem substituindo gradualmente o VaR pelo Expected Shortfall como medida regulatória de risco de mercado. Modelos mais precisos em períodos de estresse permitem uma alocação de capital mais adequada e contribuem para a estabilidade financeira. Episódios recentes mostram essa necessidade. No choque da pandemia de COVID-19, o dólar subiu quase 50% frente ao real entre o início de 2020 e maio do mesmo ano. Entre meados de 2020 e meados de 2022, o preço internacional da soja mais que dobrou, com efeitos diretos sobre a receita e o risco das empresas do setor.</w:t>
         </w:r>
       </w:ins>
       <w:commentRangeEnd w:id="1"/>
@@ -1279,7 +1279,7 @@
         <w:ind w:firstLine="709"/>
       </w:pPr>
       <w:r>
-        <w:t xml:space="preserve">Do ponto de vista econômico-social, a pesquisa alinha-se ao escopo da Engenharia de Produção ao integrar pesquisa operacional, modelagem estatística, ciência de dados e engenharia econômica em torno de um problema concreto de tomada de decisão sob incerteza. A interpretabilidade promovida pelo uso de SHAP values agrega valor adicional ao reduzir a opacidade característica de modelos de deep learning, condição cada vez mais demandada por reguladores, comitês de risco e auditorias internas, e fortalecendo a governança de modelos quantitativos em ambientes corporativos.</w:t>
+        <w:t xml:space="preserve">A pesquisa alinha-se ao escopo da Engenharia de Produção ao integrar pesquisa operacional, modelagem estatística, ciência de dados e engenharia econômica em torno de um problema concreto de tomada de decisão sob incerteza. A interpretabilidade promovida pelo uso de SHAP values agrega valor adicional ao reduzir a opacidade característica de modelos de deep learning, condição cada vez mais demandada por reguladores, comitês de risco e auditorias internas, e fortalecendo a governança de modelos quantitativos em ambientes corporativos.</w:t>
       </w:r>
     </w:p>
     <w:p>
@@ -3634,7 +3634,7 @@
         <w:jc w:val="both"/>
       </w:pPr>
       <w:r>
-        <w:t xml:space="preserve">A modelagem da volatilidade constitui um dos pilares da moderna teoria de risco financeiro, sobretudo após a consolidação do Value at Risk (VaR) como métrica padrão de gestão de risco a partir da década de 1990. A literatura clássica demonstra que os retornos financeiros apresentam propriedades estatísticas incompatíveis com a hipótese de normalidade homocedástica, destacando-se a presença de caudas pesadas, assimetria, volatilidade agrupada (volatility clustering) e mudanças estruturais ao longo do tempo. Nesse contexto, Engle (1982) propôs o modelo ARCH (Autoregressive Conditional Heteroskedasticity), posteriormente generalizado por Bollerslev (1986) no modelo GARCH, estabelecendo o framework econométrico dominante para a modelagem de volatilidade condicional.</w:t>
+        <w:t xml:space="preserve">A modelagem da volatilidade é parte da análise do risco financeiro, sobretudo após a consolidação do Value at Risk (VaR) como métrica padrão de gestão de risco a partir da década de 1990. A literatura clássica demonstra que os retornos financeiros apresentam propriedades estatísticas incompatíveis com a hipótese de normalidade homocedástica, destacando-se a presença de caudas pesadas, assimetria, volatilidade agrupada (volatility clustering) e mudanças estruturais ao longo do tempo. Nesse contexto, Engle (1982) propôs o modelo ARCH (Autoregressive Conditional Heteroskedasticity), posteriormente generalizado por Bollerslev (1986) no modelo GARCH, ampliando as ferramentas para modelar a volatilidade condicional.</w:t>
       </w:r>
     </w:p>
     <w:p>
@@ -3736,7 +3736,7 @@
         <w:jc w:val="both"/>
       </w:pPr>
       <w:r>
-        <w:t xml:space="preserve">A implementação prática dos modelos de regime switching evoluiu significativamente nas últimas décadas. Rabiner (1989) sistematizou os Hidden Markov Models (HMM), detalhando algoritmos fundamentais como Forward-Backward, Viterbi e Baum-Welch, amplamente utilizados na inferência de estados ocultos e estimação de parâmetros. Embora inicialmente desenvolvidos em processamento de sinais e reconhecimento de fala, os HMM passaram a ser aplicados de forma crescente em finanças quantitativas devido à sua capacidade de inferir regimes latentes de mercado.</w:t>
+        <w:t xml:space="preserve">Os algoritmos de estimação permitem aplicar os modelos de mudança de regime. Rabiner (1989) sistematizou os Hidden Markov Models (HMM), detalhando algoritmos fundamentais como Forward-Backward, Viterbi e Baum-Welch, amplamente utilizados na inferência de estados ocultos e estimação de parâmetros. Embora inicialmente desenvolvidos em processamento de sinais e reconhecimento de fala, os HMM passaram a ser aplicados de forma crescente em finanças quantitativas devido à sua capacidade de inferir regimes latentes de mercado.</w:t>
       </w:r>
     </w:p>
     <w:p>
@@ -3756,7 +3756,7 @@
         <w:jc w:val="both"/>
       </w:pPr>
       <w:r>
-        <w:t xml:space="preserve">Ardia et al. (2019) destacam ainda que o desenvolvimento do pacote MSGARCH em linguagem R representou um avanço importante para aplicações empíricas, reduzindo as barreiras computacionais associadas à estimação desses modelos. Os autores demonstram empiricamente que o MS-GARCH supera o GARCH convencional em períodos de elevada volatilidade, especialmente na modelagem de caudas extremas e no backtesting de métricas de risco. Tais evidências reforçam a relevância do regime switching como mecanismo fundamental para modelagem financeira em mercados emergentes.</w:t>
+        <w:t xml:space="preserve">Ardia et al. (2019) destacam ainda que o desenvolvimento do pacote MSGARCH em linguagem R facilitou a estimação e o uso desses modelos em aplicações empíricas. Os autores demonstram empiricamente que o MS-GARCH supera o GARCH convencional em períodos de elevada volatilidade, especialmente na modelagem de caudas extremas e no backtesting de métricas de risco. Tais evidências reforçam a relevância do regime switching como mecanismo fundamental para modelagem financeira em mercados emergentes.</w:t>
       </w:r>
     </w:p>
     <w:p>
@@ -3768,7 +3768,7 @@
       <w:r>
         <w:t xml:space="preserve">No contexto brasileiro, a importância dos modelos de mudança de regime é potencializada pela elevada exposição do mercado a choques macroeconômicos, instabilidade </w:t>
         <w:lastRenderedPageBreak/>
-        <w:t>política e crises cambiais. Episódios como a recessão de 2015-2016, a pandemia de COVID-19 e os ciclos de aperto monetário recentes evidenciam que a dinâmica dos retornos e da volatilidade no Brasil é fortemente dependente do regime econômico vigente. Dessa forma, a utilização de HMM e MS-GARCH apresenta aderência conceitual relevante para o problema de pesquisa proposto neste trabalho.</w:t>
+        <w:t xml:space="preserve">política e crises cambiais. Episódios como a recessão de 2015-2016, a pandemia de COVID-19 e os ciclos de aperto monetário recentes evidenciam que a dinâmica dos retornos e da volatilidade no Brasil é fortemente dependente do regime econômico vigente. Dessa forma, a utilização de HMM e MS-GARCH é pertinente ao problema estudado.</w:t>
       </w:r>
     </w:p>
     <w:p>
@@ -3796,7 +3796,7 @@
         <w:jc w:val="both"/>
       </w:pPr>
       <w:r>
-        <w:t xml:space="preserve">Entre as arquiteturas mais relevantes para séries temporais financeiras destacam-se as redes Long Short-Term Memory (LSTM), propostas por Hochreiter e Schmidhuber (1997). Os autores desenvolveram a arquitetura com o objetivo de superar o problema do desaparecimento do gradiente (vanishing gradient), recorrente em redes neurais recorrentes tradicionais. A principal inovação da LSTM reside na introdução de mecanismos de memória e gates de entrada, esquecimento e saída, permitindo preservar dependências de longo prazo ao longo da sequência temporal.</w:t>
+        <w:t xml:space="preserve">Entre as arquiteturas mais relevantes para séries temporais financeiras destacam-se as redes Long Short-Term Memory (LSTM), propostas por Hochreiter e Schmidhuber (1997). Os autores desenvolveram a arquitetura com o objetivo de superar o problema do desaparecimento do gradiente (vanishing gradient), recorrente em redes neurais recorrentes tradicionais. A LSTM utiliza mecanismos de memória e gates de entrada, esquecimento e saída, permitindo preservar dependências de longo prazo ao longo da sequência temporal.</w:t>
       </w:r>
     </w:p>
     <w:p>
@@ -3816,7 +3816,7 @@
         <w:jc w:val="both"/>
       </w:pPr>
       <w:r>
-        <w:t xml:space="preserve">Os resultados encontrados por Fischer e Krauss (2018) mostram que o desempenho da LSTM concentra-se especialmente em períodos de elevada volatilidade, sugerindo que a arquitetura possui capacidade de capturar padrões complexos associados a regimes de estresse. Essa evidência fornece importante motivação para o desenvolvimento de modelos híbridos que integrem explicitamente estruturas de mudança de regime ao processo de previsão profunda.</w:t>
+        <w:t xml:space="preserve">Os resultados encontrados por Fischer e Krauss (2018) mostram que o desempenho da LSTM concentra-se especialmente em períodos de elevada volatilidade, sugerindo que a arquitetura possui capacidade de capturar padrões complexos associados a regimes de estresse. Essa evidência motiva a avaliação de modelos híbridos que integrem explicitamente estruturas de mudança de regime ao processo de previsão profunda.</w:t>
       </w:r>
     </w:p>
     <w:p>
@@ -3837,7 +3837,7 @@
         <w:jc w:val="both"/>
       </w:pPr>
       <w:r>
-        <w:t xml:space="preserve">Entretanto, apesar dos avanços observados na literatura, grande parte dos modelos profundos ainda trata o regime de mercado como variável exógena ou simplesmente ignora a existência de estados latentes distintos. Essa lacuna é particularmente relevante em mercados emergentes, nos quais mudanças abruptas de regime ocorrem com frequência elevada. Nesse sentido, o condicionamento explícito do forecast de redes LSTM a regimes detectados por Hidden Markov Models representa uma possibilidade promissora de integração entre aprendizado profundo e modelagem econométrica de regimes.</w:t>
+        <w:t xml:space="preserve">Entretanto, apesar dos avanços observados na literatura, grande parte dos modelos profundos ainda trata o regime de mercado como variável exógena ou simplesmente ignora a existência de estados latentes distintos. Essa lacuna é particularmente relevante em mercados emergentes, nos quais mudanças abruptas de regime ocorrem com frequência elevada. O uso dos regimes identificados por HMM como entrada de uma LSTM permite investigar a integração entre aprendizado profundo e modelagem econométrica de regimes.</w:t>
       </w:r>
     </w:p>
     <w:p>
@@ -3847,7 +3847,7 @@
         <w:jc w:val="both"/>
       </w:pPr>
       <w:r>
-        <w:t xml:space="preserve">Outro aspecto relevante na literatura recente diz respeito à interpretabilidade de modelos complexos. Conforme argumentam Lundberg e Lee (2017), arquiteturas profundas frequentemente operam como caixas-pretas, dificultando a compreensão das relações aprendidas e limitando sua adoção em ambientes regulados. Os autores propõem o método SHAP (SHapley Additive exPlanations), fundamentado na teoria dos jogos cooperativos, para atribuir importância às variáveis explicativas de maneira consistente.</w:t>
+        <w:t xml:space="preserve">A interpretação das previsões também precisa ser considerada. Conforme argumentam Lundberg e Lee (2017), arquiteturas profundas frequentemente operam como caixas-pretas, dificultando a compreensão das relações aprendidas e limitando sua adoção em ambientes regulados. Os autores propõem o método SHAP (SHapley Additive exPlanations), fundamentado na teoria dos jogos cooperativos, para atribuir importância às variáveis explicativas de maneira consistente.</w:t>
       </w:r>
     </w:p>
     <w:p>
@@ -3867,7 +3867,7 @@
         <w:jc w:val="both"/>
       </w:pPr>
       <w:r>
-        <w:t xml:space="preserve">Dessa forma, a literatura recente aponta para uma convergência entre três grandes linhas de pesquisa: modelos de mudança de regime, arquiteturas profundas de aprendizado temporal e técnicas de interpretabilidade em inteligência artificial. O presente trabalho posiciona-se precisamente nesse espaço de convergência, propondo uma arquitetura híbrida capaz de integrar identificação de regimes via HMM, previsão profunda por LSTM e interpretação dos drivers de risco por meio de SHAP.</w:t>
+        <w:t xml:space="preserve">A revisão relaciona modelos de mudança de regime, arquiteturas profundas de aprendizado temporal e técnicas de interpretabilidade em inteligência artificial. O trabalho propõe uma arquitetura híbrida capaz de integrar identificação de regimes via HMM, previsão profunda por LSTM e interpretação dos drivers de risco por meio de SHAP.</w:t>
       </w:r>
     </w:p>
     <w:p>
@@ -3908,7 +3908,7 @@
         <w:jc w:val="both"/>
       </w:pPr>
       <w:r>
-        <w:t>Esta pesquisa caracteriza-se como tecnológica de natureza aplicada, com abordagem quantitativa e finalidade explicativo-preditiva. Quanto aos meios, configura-se como pesquisa experimental e bibliográfica: experimental porque envolve a especificação, calibração e teste de uma arquitetura computacional integrada para estimação de risco, com avaliação empírica em dados reais; e bibliográfica porque os fundamentos teóricos e metodológicos derivam do levantamento sistemático apresentado no Quadro 2 da revisão da literatura. Todos os cinco objetivos específicos são contemplados pelos procedimentos descritos a seguir.</w:t>
+        <w:t xml:space="preserve">A pesquisa é aplicada e quantitativa, voltada à previsão de risco. Quanto aos meios, configura-se como pesquisa experimental e bibliográfica: experimental porque envolve a especificação, calibração e teste de uma arquitetura computacional integrada para estimação de risco, com avaliação empírica em dados reais; e bibliográfica porque os fundamentos teóricos e metodológicos derivam do levantamento sistemático apresentado no Quadro 2 da revisão da literatura. Todos os cinco objetivos específicos são contemplados pelos procedimentos descritos a seguir.</w:t>
       </w:r>
     </w:p>
     <w:p>
@@ -3918,7 +3918,7 @@
         <w:jc w:val="both"/>
       </w:pPr>
       <w:r>
-        <w:t xml:space="preserve">A correspondência entre os objetivos específicos e as subseções metodológicas é a seguinte: o OE1 (engenharia de features) é tratado em 3.1 e 3.2; o OE2 (detecção de regimes via HMM) em 3.3; o OE3 (LSTM multivariada com forecast condicional ao regime e Monte Carlo) em 3.4 e 3.5; o OE4 (estimação de VaR e ES condicionais e benchmark MS-GARCH) em 3.6, 3.7 e 3.8; o OE5 (interpretabilidade via SHAP) em 3.9. A subseção 3.10 descreve o stack tecnológico empregado.</w:t>
+        <w:t xml:space="preserve">A correspondência entre os objetivos específicos e as subseções metodológicas é a seguinte: o OE1 (engenharia de features) é tratado em 3.1 e 3.2; o OE2 (detecção de regimes via HMM) em 3.3; o OE3 (LSTM multivariada com forecast condicional ao regime e Monte Carlo) em 3.4 e 3.5; o OE4 (estimação de VaR e ES condicionais e benchmark MS-GARCH) em 3.6, 3.7 e 3.8; o OE5 (interpretabilidade via SHAP) em 3.9. A subseção 3.10 apresenta as ferramentas de implementação.</w:t>
       </w:r>
     </w:p>
     <w:p>
@@ -4325,7 +4325,7 @@
         <w:ind w:firstLine="709"/>
       </w:pPr>
       <w:r>
-        <w:t xml:space="preserve">Como análise complementar — não como contribuição central do trabalho — aplica-se SHAP (SHapley Additive exPlanations; Lundberg e Lee, 2017) à rede LSTM treinada, a fim de identificar as features mais influentes na previsão dos retornos em cada regime detectado pelo HMM. A implementação utiliza a aproximação DeepSHAP. Os resultados são reportados apenas como ranking de importância global de features por regime, e a discussão verifica se as features dominantes têm aderência à intuição econômica (espera-se, por exemplo, predominância da volatilidade implícita e de variáveis macro em regime de estresse). Essa análise é discutida no capítulo de resultados, mas o sucesso ou insucesso do trabalho não depende dela.</w:t>
+        <w:t xml:space="preserve">Como análise complementar — não como contribuição central do trabalho — aplica-se SHAP (SHapley Additive exPlanations; Lundberg e Lee, 2017) à rede LSTM treinada, para identificar as variáveis mais influentes na previsão dos retornos em cada regime detectado pelo HMM. A implementação utiliza a aproximação DeepSHAP. Os resultados são reportados apenas como ranking de importância global de features por regime, e a discussão verifica se as features dominantes têm aderência à intuição econômica (espera-se, por exemplo, predominância da volatilidade implícita e de variáveis macro em regime de estresse). Essa análise é discutida no capítulo de resultados, mas o sucesso ou insucesso do trabalho não depende dela.</w:t>
       </w:r>
     </w:p>
     <w:p>
@@ -4356,7 +4356,7 @@
         <w:ind w:firstLine="709"/>
       </w:pPr>
       <w:r>
-        <w:t xml:space="preserve">A implementação computacional adota stack híbrido Python + R. Em Python, são utilizadas as bibliotecas pandas e NumPy para manipulação de dados, scikit-learn para pré-processamento e métricas, hmmlearn para a calibração dos HMM gaussianos, PyTorch para a implementação das arquiteturas LSTM (com suporte a CUDA para aceleração por GPU quando aplicável), arch para os modelos GARCH univariados e implementações auxiliares de backtesting, e shap para a análise de interpretabilidade. Em R, utiliza-se exclusivamente o pacote MSGARCH (Ardia et al., 2019) para a estimação do benchmark econométrico, com integração ao pipeline Python via interface rpy2 ou exportação intermediária em formato CSV.</w:t>
+        <w:t xml:space="preserve">A implementação combina Python e R. Em Python, são utilizadas as bibliotecas pandas e NumPy para manipulação de dados, scikit-learn para pré-processamento e métricas, hmmlearn para a calibração dos HMM gaussianos, PyTorch para a implementação das arquiteturas LSTM (com suporte a CUDA para aceleração por GPU quando aplicável), arch para os modelos GARCH univariados e implementações auxiliares de backtesting, e shap para a análise de interpretabilidade. Em R, utiliza-se exclusivamente o pacote MSGARCH (Ardia et al., 2019) para a estimação do benchmark econométrico, com integração ao pipeline Python via interface rpy2 ou exportação intermediária em formato CSV.</w:t>
       </w:r>
     </w:p>
     <w:p>
@@ -4419,7 +4419,7 @@
         <w:ind w:firstLine="709"/>
       </w:pPr>
       <w:r>
-        <w:t>Os critérios formais de sucesso do trabalho são quatro: (a) o pipeline ponta a ponta deve rodar de forma reprodutível sobre o conjunto de teste lacrado; (b) o HMM deve convergir e identificar regimes economicamente interpretáveis (verificação qualitativa); (c) ao menos uma das três hipóteses H1, H2 ou H3 deve ser sustentada por evidência estatística formal; e (d) a discussão de resultados deve apontar limitações concretas e sugerir extensões. Cabe registrar que a refutação das hipóteses também constitui um resultado válido e relevante para o trabalho, na medida em que delimita as condições sob as quais o condicionamento ao regime adiciona ou não valor preditivo.</w:t>
+        <w:t xml:space="preserve">Os critérios formais de sucesso do trabalho são quatro: (a) o pipeline ponta a ponta deve rodar de forma reprodutível sobre o conjunto de teste lacrado; (b) o HMM deve convergir e identificar regimes economicamente interpretáveis (verificação qualitativa); (c) ao menos uma das três hipóteses H1, H2 ou H3 deve ser sustentada por evidência estatística formal; e (d) a discussão de resultados deve apontar limitações concretas e sugerir extensões. Cabe observar que a refutação das hipóteses também constitui um resultado válido e relevante para o trabalho, na medida em que delimita as condições sob as quais o condicionamento ao regime adiciona ou não valor preditivo.</w:t>
       </w:r>
     </w:p>
     <w:p>

</xml_diff>

<commit_message>
Update merge quebrado, e revisão na parte textextual
</commit_message>
<xml_diff>
--- a/docs/projeto_tcc_agro_rev1.docx
+++ b/docs/projeto_tcc_agro_rev1.docx
@@ -144,22 +144,12 @@
       <w:pPr>
         <w:spacing w:after="0"/>
       </w:pPr>
-      <w:del w:id="9003" w:author="Claude" w:date="2026-10-19T12:00:00Z">
-        <w:r>
-          <w:rPr>
-            <w:szCs w:val="24"/>
-          </w:rPr>
-          <w:delText>ESTIMAÇÃO DE VAR E EXPECTED SHORTFALL CONDICIONAIS AO REGIME DE MERCADO: UMA ABORDAGEM HÍBRIDA COM HIDDEN MARKOV MODELS E REDES LSTM APLICADA A CARTEIRAS BRASILEIRAS</w:delText>
-        </w:r>
-      </w:del>
-      <w:ins w:id="9004" w:author="Claude" w:date="2026-10-19T12:00:00Z">
-        <w:r>
-          <w:rPr>
-            <w:szCs w:val="24"/>
-          </w:rPr>
-          <w:t xml:space="preserve">ESTIMAÇÃO DE VAR E EXPECTED SHORTFALL CONDICIONAIS AO REGIME DE MERCADO: UMA ABORDAGEM HÍBRIDA COM HIDDEN MARKOV MODELS E REDES LSTM APLICADA A UMA CARTEIRA DO AGRONEGÓCIO BRASILEIRO</w:t>
-        </w:r>
-      </w:ins>
+      <w:r>
+        <w:rPr>
+          <w:szCs w:val="24"/>
+        </w:rPr>
+        <w:t xml:space="preserve">ESTIMAÇÃO DE VAR E EXPECTED SHORTFALL CONDICIONAIS AO REGIME DE MERCADO: UMA ABORDAGEM HÍBRIDA COM HIDDEN MARKOV MODELS E REDES LSTM APLICADA A UMA CARTEIRA DO AGRONEGÓCIO BRASILEIRO</w:t>
+      </w:r>
     </w:p>
     <w:p>
       <w:pPr>
@@ -813,16 +803,9 @@
         <w:spacing w:after="0"/>
         <w:ind w:firstLine="708"/>
       </w:pPr>
-      <w:del w:id="9005" w:author="Claude" w:date="2026-10-19T12:00:00Z">
-        <w:r>
-          <w:delText xml:space="preserve">A estimação do risco de mercado constitui um dos pilares da gestão financeira moderna e, em sua versão tradicional, apoia-se em modelos paramétricos que assumem normalidade dos retornos, homocedasticidade ou, no máximo, volatilidade condicional do tipo GARCH. Tais hipóteses, contudo, mostram-se sistematicamente violadas em mercados emergentes, em que ocorrem caudas pesadas, dependências não lineares e mudanças estruturais abruptas, sobretudo em períodos de estresse. Diante dessas limitações, a presente pesquisa investiga a integração de modelos estatísticos, técnicas de aprendizado profundo (deep learning) e modelos de mudança de regime (regime switching) para a estimação do Value at Risk (VaR) e do Expected Shortfall (ES) em uma carteira multivariada composta por ações brasileiras, commodities e câmbio.</w:delText>
-        </w:r>
-      </w:del>
-      <w:ins w:id="9006" w:author="Claude" w:date="2026-10-19T12:00:00Z">
-        <w:r>
-          <w:t xml:space="preserve">Medir o risco de mercado é uma das tarefas centrais da gestão financeira. Na prática, boa parte dos modelos usados ainda parte de hipóteses simples: retornos com distribuição normal, volatilidade constante ou, no máximo, volatilidade condicional do tipo GARCH. Em mercados emergentes, essas hipóteses costumam falhar. Os retornos têm caudas pesadas, as relações entre os ativos não são lineares e o comportamento do mercado muda de forma brusca em períodos de estresse. Diante disso, este trabalho investiga se a combinação de modelos de mudança de regime (regime switching) com redes neurais recorrentes (deep learning) melhora a estimação do Value at Risk (VaR) e do Expected Shortfall (ES) de uma carteira ligada ao agronegócio brasileiro, formada por ações do setor, contratos futuros de commodities agrícolas e câmbio.</w:t>
-        </w:r>
-      </w:ins>
+      <w:r>
+        <w:t xml:space="preserve">Medir o risco de mercado é uma das tarefas centrais da gestão financeira. Na prática, boa parte dos modelos usados ainda parte de hipóteses simples: retornos com distribuição normal, volatilidade constante ou, no máximo, volatilidade condicional do tipo GARCH. Em mercados emergentes, essas hipóteses costumam falhar. Os retornos têm caudas pesadas, as relações entre os ativos não são lineares e o comportamento do mercado muda de forma brusca em períodos de estresse. Diante disso, este trabalho investiga se a combinação de modelos de mudança de regime (regime switching) com redes neurais recorrentes (deep learning) melhora a estimação do Value at Risk (VaR) e do Expected Shortfall (ES) de uma carteira ligada ao agronegócio brasileiro, formada por ações do setor, contratos futuros de commodities agrícolas e câmbio.</w:t>
+      </w:r>
     </w:p>
     <w:p>
       <w:pPr>
@@ -840,25 +823,13 @@
         <w:spacing w:after="0"/>
         <w:ind w:firstLine="708"/>
       </w:pPr>
-      <w:del w:id="9007" w:author="Claude" w:date="2026-10-19T12:00:00Z">
-        <w:r>
-          <w:delText xml:space="preserve">Apesar da disponibilidade desse ferramental, persiste no estado da arte uma fragmentação metodológica: modelos econométricos capturam a heterocedasticidade condicional, mas falham em representar não linearidades; modelos de deep learning capturam dependências temporais complexas, mas desconsideram a estrutura latente de regimes; e modelos de mudança de regime, embora identifiquem estados de mercado, costumam ser empregados de forma isolada. A tese central defendida neste trabalho é a de que condicionar o forecast de uma rede LSTM ao regime de mercado detectado por um Hidden Markov Model (HMM) produz estimativas de Value at Risk (VaR) e Expected Shortfall (ES) mais acuradas do que o benchmark econométrico MS-GARCH, em particular em regimes de alta volatilidade, sem perda significativa de desempenho em regimes de calmaria. Essa tese é testada </w:delText>
-          <w:lastRenderedPageBreak/>
-          <w:delText xml:space="preserve">empiricamente em uma carteira composta por sete ativos representativos do mercado brasileiro, em janela de vinte anos (2005-2024), com validação por procedimentos formais de backtesting.</w:delText>
-        </w:r>
-      </w:del>
-      <w:commentRangeStart w:id="2"/>
-      <w:ins w:id="9008" w:author="Claude" w:date="2026-10-19T12:00:00Z">
-        <w:r>
-          <w:t xml:space="preserve">Apesar de esse ferramental estar disponível, as abordagens ainda costumam ser usadas separadamente. Os modelos econométricos capturam bem a variação da volatilidade ao longo do tempo, mas têm dificuldade com não linearidades; as redes de deep learning capturam dependências temporais complexas, mas ignoram que o mercado alterna entre regimes; e os modelos de mudança de regime identificam esses estados, mas raramente são usados para alimentar outros modelos. A tese defendida neste trabalho é que condicionar a previsão de uma rede LSTM ao regime de mercado identificado por um Hidden Markov Model (HMM) produz estimativas de VaR e ES mais precisas do que o modelo econométrico de referência, o MS-GARCH, sobretudo em períodos de alta volatilidade e sem perda relevante de desempenho em períodos de calmaria. A tese é testada em uma carteira de sete ativos ligados ao agronegócio brasileiro (as ações da SLC Agrícola, da JBS, da Marfrig e da São Martinho, os contratos futuros de soja e de café arábica e a taxa de câmbio USD/BRL) no período de 2005 a 2024, com validação por testes formais de backtesting.</w:t>
-        </w:r>
-      </w:ins>
-      <w:commentRangeEnd w:id="2"/>
+      <w:r>
+        <w:t xml:space="preserve">Apesar de esse ferramental estar disponível, as abordagens ainda costumam ser usadas separadamente. Os modelos econométricos capturam bem a variação da volatilidade ao longo do tempo, mas têm dificuldade com não linearidades; as redes de deep learning capturam dependências temporais complexas, mas ignoram que o mercado alterna entre regimes; e os modelos de mudança de regime identificam esses estados, mas raramente são usados para alimentar outros modelos. A tese defendida neste trabalho é que condicionar a previsão de uma rede LSTM ao regime de mercado identificado por um Hidden Markov Model (HMM) produz estimativas de VaR e ES mais precisas do que o modelo econométrico de referência, o MS-GARCH, sobretudo em períodos de alta volatilidade e sem perda relevante de desempenho em períodos de calmaria. A tese é testada em uma carteira de sete ativos ligados ao agronegócio brasileiro (as ações da SLC Agrícola, da JBS, da Marfrig e da São Martinho, os contratos futuros de soja e de café arábica e a taxa de câmbio USD/BRL) no período de 2005 a 2024, com validação por testes formais de backtesting.</w:t>
+      </w:r>
       <w:r>
         <w:rPr>
           <w:rStyle w:val="CommentReference"/>
         </w:rPr>
-        <w:commentReference w:id="2"/>
       </w:r>
     </w:p>
     <w:p>
@@ -866,22 +837,15 @@
         <w:pStyle w:val="TextoGeral"/>
         <w:spacing w:after="0"/>
         <w:ind w:firstLine="708"/>
-        <w:rPr>
-          <w:ins w:id="9001" w:author="Claude" w:date="2026-10-19T12:00:00Z"/>
-        </w:rPr>
-      </w:pPr>
-      <w:commentRangeStart w:id="0"/>
-      <w:ins w:id="9002" w:author="Claude" w:date="2026-10-19T12:00:00Z">
-        <w:r>
-          <w:t xml:space="preserve">O agronegócio foi escolhido por sua relevância econômica e pela diversidade de suas exposições ao risco. O setor responde por cerca de um quarto do PIB brasileiro e por perto de metade das exportações do país, e suas empresas estão expostas ao mesmo tempo a três fontes de risco que se influenciam: o preço internacional das commodities, negociadas em dólar nas bolsas de Chicago (CBOT) e de Nova York (ICE); a taxa de câmbio, que converte esse preço em receita em reais; e o próprio ciclo do mercado acionário brasileiro. Choques climáticos, safras recordes ou frustradas, mudanças na demanda chinesa e crises cambiais podem alterar de forma abrupta o comportamento conjunto desses ativos, que é exatamente o tipo de mudança que um modelo de regimes procura capturar.</w:t>
-        </w:r>
-      </w:ins>
-      <w:commentRangeEnd w:id="0"/>
+        <w:rPr/>
+      </w:pPr>
+      <w:r>
+        <w:t xml:space="preserve">O agronegócio foi escolhido por sua relevância econômica e pela diversidade de suas exposições ao risco. O setor responde por cerca de um quarto do PIB brasileiro e por perto de metade das exportações do país, e suas empresas estão expostas ao mesmo tempo a três fontes de risco que se influenciam: o preço internacional das commodities, negociadas em dólar nas bolsas de Chicago (CBOT) e de Nova York (ICE); a taxa de câmbio, que converte esse preço em receita em reais; e o próprio ciclo do mercado acionário brasileiro. Choques climáticos, safras recordes ou frustradas, mudanças na demanda chinesa e crises cambiais podem alterar de forma abrupta o comportamento conjunto desses ativos, que é exatamente o tipo de mudança que um modelo de regimes procura capturar.</w:t>
+      </w:r>
       <w:r>
         <w:rPr>
           <w:rStyle w:val="CommentReference"/>
         </w:rPr>
-        <w:commentReference w:id="0"/>
       </w:r>
     </w:p>
     <w:p>
@@ -918,16 +882,9 @@
         <w:spacing w:after="0"/>
         <w:ind w:firstLine="709"/>
       </w:pPr>
-      <w:del w:id="9009" w:author="Claude" w:date="2026-10-19T12:00:00Z">
-        <w:r>
-          <w:delText xml:space="preserve">A mensuração do risco de mercado em carteiras multivariadas brasileiras enfrenta três desafios estruturais: a presença de não linearidades e dependências de longo prazo entre os ativos, a ocorrência de mudanças abruptas de regime – tipicamente associadas a choques macroeconômicos, crises cambiais e eventos políticos – e a limitada interpretabilidade dos modelos de aprendizado de máquina mais flexíveis. Modelos da família GARCH assumem persistência homogênea da volatilidade, modelos LSTM tradicionais não condicionam suas previsões à estrutura latente do mercado, e métricas como VaR e ES, quando estimadas sem considerar o regime vigente, tendem a subestimar perdas em períodos de estresse e a superestimá-las em períodos de calmaria.</w:delText>
-        </w:r>
-      </w:del>
-      <w:ins w:id="9010" w:author="Claude" w:date="2026-10-19T12:00:00Z">
-        <w:r>
-          <w:t xml:space="preserve">Estimar o risco de uma carteira brasileira com vários ativos esbarra em três dificuldades. A primeira é que as relações entre os ativos não são lineares e podem persistir por longos períodos. A segunda é que o mercado muda de comportamento de forma abrupta, em geral após choques macroeconômicos, crises cambiais ou eventos políticos e, no caso do agronegócio, também após choques de oferta, como quebras de safra e eventos climáticos. A terceira é que os modelos de aprendizado de máquina mais flexíveis são difíceis de interpretar. Os modelos da família GARCH supõem que a volatilidade persiste sempre da mesma forma; as redes LSTM tradicionais não levam em conta o estado em que o mercado se encontra; e o VaR e o ES, quando estimados sem considerar o regime vigente, tendem a subestimar as perdas em períodos de estresse e a superestimá-las em períodos de calmaria.</w:t>
-        </w:r>
-      </w:ins>
+      <w:r>
+        <w:t xml:space="preserve">Estimar o risco de uma carteira brasileira com vários ativos esbarra em três dificuldades. A primeira é que as relações entre os ativos não são lineares e podem persistir por longos períodos. A segunda é que o mercado muda de comportamento de forma abrupta, em geral após choques macroeconômicos, crises cambiais ou eventos políticos e, no caso do agronegócio, também após choques de oferta, como quebras de safra e eventos climáticos. A terceira é que os modelos de aprendizado de máquina mais flexíveis são difíceis de interpretar. Os modelos da família GARCH supõem que a volatilidade persiste sempre da mesma forma; as redes LSTM tradicionais não levam em conta o estado em que o mercado se encontra; e o VaR e o ES, quando estimados sem considerar o regime vigente, tendem a subestimar as perdas em períodos de estresse e a superestimá-las em períodos de calmaria.</w:t>
+      </w:r>
     </w:p>
     <w:p>
       <w:pPr>
@@ -935,16 +892,9 @@
         <w:spacing w:after="0"/>
         <w:ind w:firstLine="709"/>
       </w:pPr>
-      <w:del w:id="9011" w:author="Claude" w:date="2026-10-19T12:00:00Z">
-        <w:r>
-          <w:delText xml:space="preserve">Esta pesquisa caracteriza-se como tecnológica de natureza aplicada, dado que propõe uma arquitetura computacional integrada para a estimação de risco financeiro, com validação empírica em dados reais do mercado brasileiro. O setor produtivo de aplicação compreende instituições financeiras, gestoras de recursos, tesourarias corporativas e áreas de risco que necessitam de métricas de VaR e ES robustas a mudanças de regime para atendimento regulatório (Basileia III, Resolução CMN 4.557/2017) e para suporte à tomada de decisão em alocação de capital.</w:delText>
-        </w:r>
-      </w:del>
-      <w:ins w:id="9012" w:author="Claude" w:date="2026-10-19T12:00:00Z">
-        <w:r>
-          <w:t xml:space="preserve">Quanto à natureza, trata-se de uma pesquisa tecnológica e aplicada: propõe-se uma arquitetura computacional integrada para estimar risco financeiro, validada com dados reais de mercado. Os potenciais usuários são instituições financeiras, gestoras de recursos, áreas de risco e tesourarias corporativas, inclusive as de empresas do agronegócio, que lidam diariamente com o risco de preço das commodities e o risco cambial. Todos precisam de medidas de VaR e ES robustas a mudanças de regime, tanto para atender à regulação (Basileia III e Resolução CMN n.º 4.557/2017) quanto para apoiar decisões de alocação de capital e de proteção (hedge).</w:t>
-        </w:r>
-      </w:ins>
+      <w:r>
+        <w:t xml:space="preserve">Quanto à natureza, trata-se de uma pesquisa tecnológica e aplicada: propõe-se uma arquitetura computacional integrada para estimar risco financeiro, validada com dados reais de mercado. Os potenciais usuários são instituições financeiras, gestoras de recursos, áreas de risco e tesourarias corporativas, inclusive as de empresas do agronegócio, que lidam diariamente com o risco de preço das commodities e o risco cambial. Todos precisam de medidas de VaR e ES robustas a mudanças de regime, tanto para atender à regulação (Basileia III e Resolução CMN n.º 4.557/2017) quanto para apoiar decisões de alocação de capital e de proteção (hedge).</w:t>
+      </w:r>
     </w:p>
     <w:p>
       <w:pPr>
@@ -952,16 +902,9 @@
         <w:spacing w:after="0"/>
         <w:ind w:firstLine="709"/>
       </w:pPr>
-      <w:del w:id="9013" w:author="Claude" w:date="2026-10-19T12:00:00Z">
-        <w:r>
-          <w:delText xml:space="preserve">A literatura recente aponta para a superioridade de modelos híbridos – a exemplo de ARIMA-LSTM e GARCH-XGBoost (RABBANI et al., 2025) e de arquiteturas profundas aplicadas a big data financeiro (SARKAR, 2025) – em comparação a abordagens isoladas. Contudo, a maior parte desses trabalhos trata o regime de mercado como variável exógena ou simplesmente o ignora, o que compromete a estabilidade das estimativas de risco em janelas de transição. No mercado brasileiro, em particular, a alta sensibilidade a choques externos e internos amplifica a relevância dessa lacuna.</w:delText>
-        </w:r>
-      </w:del>
-      <w:ins w:id="9014" w:author="Claude" w:date="2026-10-19T12:00:00Z">
-        <w:r>
-          <w:t xml:space="preserve">A literatura recente indica que modelos híbridos, como as combinações ARIMA-LSTM e GARCH-XGBoost (RABBANI et al., 2025) e as arquiteturas profundas aplicadas a grandes bases de dados financeiros (SARKAR, 2025), superam as abordagens isoladas. A maior parte desses trabalhos, porém, trata o regime de mercado como uma variável externa ou simplesmente o ignora, o que torna as estimativas de risco instáveis justamente nas transições entre regimes. No Brasil, e em particular no agronegócio, em que os preços das commodities e o câmbio se movem em conjunto, a sensibilidade a choques externos e internos torna essa lacuna ainda mais relevante.</w:t>
-        </w:r>
-      </w:ins>
+      <w:r>
+        <w:t xml:space="preserve">A literatura recente indica que modelos híbridos, como as combinações ARIMA-LSTM e GARCH-XGBoost (RABBANI et al., 2025) e as arquiteturas profundas aplicadas a grandes bases de dados financeiros (SARKAR, 2025), superam as abordagens isoladas. A maior parte desses trabalhos, porém, trata o regime de mercado como uma variável externa ou simplesmente o ignora, o que torna as estimativas de risco instáveis justamente nas transições entre regimes. No Brasil, e em particular no agronegócio, em que os preços das commodities e o câmbio se movem em conjunto, a sensibilidade a choques externos e internos torna essa lacuna ainda mais relevante.</w:t>
+      </w:r>
     </w:p>
     <w:p>
       <w:pPr>
@@ -969,16 +912,9 @@
         <w:spacing w:after="0"/>
         <w:ind w:firstLine="709"/>
       </w:pPr>
-      <w:del w:id="9015" w:author="Claude" w:date="2026-10-19T12:00:00Z">
-        <w:r>
-          <w:delText xml:space="preserve">Diante desse cenário, formula-se a seguinte pergunta de pesquisa: o condicionamento do forecast de uma rede LSTM ao regime de mercado detectado por um HMM produz estimativas de VaR e Expected Shortfall mais acuradas do que o benchmark MS-GARCH em uma carteira brasileira, particularmente em regimes de estresse?</w:delText>
-        </w:r>
-      </w:del>
-      <w:ins w:id="9016" w:author="Claude" w:date="2026-10-19T12:00:00Z">
-        <w:r>
-          <w:t xml:space="preserve">Diante desse cenário, a pergunta que orienta esta pesquisa é: condicionar a previsão de uma rede LSTM ao regime de mercado identificado por um HMM produz estimativas de VaR e Expected Shortfall mais precisas do que o MS-GARCH em uma carteira do agronegócio brasileiro, especialmente em regimes de estresse?</w:t>
-        </w:r>
-      </w:ins>
+      <w:r>
+        <w:t xml:space="preserve">Diante desse cenário, a pergunta que orienta esta pesquisa é: condicionar a previsão de uma rede LSTM ao regime de mercado identificado por um HMM produz estimativas de VaR e Expected Shortfall mais precisas do que o MS-GARCH em uma carteira do agronegócio brasileiro, especialmente em regimes de estresse?</w:t>
+      </w:r>
     </w:p>
     <w:p>
       <w:pPr>
@@ -986,18 +922,9 @@
         <w:spacing w:after="0"/>
         <w:ind w:firstLine="709"/>
       </w:pPr>
-      <w:del w:id="9017" w:author="Claude" w:date="2026-10-19T12:00:00Z">
-        <w:r>
-          <w:delText xml:space="preserve">A lacuna do conhecimento evidencia-se em três frentes: (i) o tratamento limitado do regime de mercado como condicionante estrutural do forecast em arquiteturas de deep learning, </w:delText>
-          <w:lastRenderedPageBreak/>
-          <w:delText>sendo tipicamente incorporado apenas como variável exógena ou desconsiderado; (ii) a ausência de comparações sistemáticas entre arquiteturas integradas HMM-LSTM e o benchmark econométrico MS-GARCH em contexto brasileiro; e (iii) a escassez de evidências sobre o comportamento diferencial de tais arquiteturas em regimes distintos, particularmente em episódios de estresse.</w:delText>
-        </w:r>
-      </w:del>
-      <w:ins w:id="9018" w:author="Claude" w:date="2026-10-19T12:00:00Z">
-        <w:r>
-          <w:t xml:space="preserve">A lacuna de conhecimento aparece em três frentes: (i) o regime de mercado raramente é usado como condicionante estrutural da previsão em arquiteturas de deep learning e, quando aparece, entra apenas como variável externa; (ii) faltam comparações sistemáticas entre arquiteturas integradas HMM-LSTM e o MS-GARCH no contexto brasileiro, e menos ainda em carteiras ligadas ao agronegócio; e (iii) há poucas evidências sobre como essas arquiteturas se comportam em cada regime, sobretudo em episódios de estresse.</w:t>
-        </w:r>
-      </w:ins>
+      <w:r>
+        <w:t xml:space="preserve">A lacuna de conhecimento aparece em três frentes: (i) o regime de mercado raramente é usado como condicionante estrutural da previsão em arquiteturas de deep learning e, quando aparece, entra apenas como variável externa; (ii) faltam comparações sistemáticas entre arquiteturas integradas HMM-LSTM e o MS-GARCH no contexto brasileiro, e menos ainda em carteiras ligadas ao agronegócio; e (iii) há poucas evidências sobre como essas arquiteturas se comportam em cada regime, sobretudo em episódios de estresse.</w:t>
+      </w:r>
     </w:p>
     <w:p>
       <w:pPr>
@@ -1015,16 +942,9 @@
         <w:spacing w:after="0"/>
         <w:ind w:firstLine="709"/>
       </w:pPr>
-      <w:del w:id="9019" w:author="Claude" w:date="2026-10-19T12:00:00Z">
-        <w:r>
-          <w:delText xml:space="preserve">O produto esperado deste trabalho é uma arquitetura computacional integrada e replicável para a estimação de VaR e ES condicionais ao regime, validada empiricamente em carteira brasileira, com a discussão comparativa de seu desempenho em relação ao benchmark MS-GARCH em diferentes regimes de mercado e a identificação dos drivers de risco por regime via análise de interpretabilidade.</w:delText>
-        </w:r>
-      </w:del>
-      <w:ins w:id="9020" w:author="Claude" w:date="2026-10-19T12:00:00Z">
-        <w:r>
-          <w:t xml:space="preserve">O produto esperado é uma arquitetura computacional integrada e replicável para estimar VaR e ES condicionais ao regime, validada em uma carteira do agronegócio brasileiro. O trabalho também compara o desempenho dessa arquitetura com o do MS-GARCH em diferentes regimes de mercado e identifica, por meio de técnicas de interpretabilidade, os principais fatores de risco em cada regime.</w:t>
-        </w:r>
-      </w:ins>
+      <w:r>
+        <w:t xml:space="preserve">O produto esperado é uma arquitetura computacional integrada e replicável para estimar VaR e ES condicionais ao regime, validada em uma carteira do agronegócio brasileiro. O trabalho também compara o desempenho dessa arquitetura com o do MS-GARCH em diferentes regimes de mercado e identifica, por meio de técnicas de interpretabilidade, os principais fatores de risco em cada regime.</w:t>
+      </w:r>
     </w:p>
     <w:p>
       <w:pPr>
@@ -1085,16 +1005,9 @@
         <w:ind w:firstLine="709"/>
         <w:jc w:val="both"/>
       </w:pPr>
-      <w:del w:id="9021" w:author="Claude" w:date="2026-10-19T12:00:00Z">
-        <w:r>
-          <w:delText xml:space="preserve">Testar empiricamente se o condicionamento do forecast de uma rede LSTM ao regime de mercado detectado por um Hidden Markov Model produz estimativas de VaR e Expected Shortfall mais acuradas do que o benchmark MS-GARCH em uma carteira composta por sete ativos representativos do mercado brasileiro, com validação por procedimentos formais de backtesting.</w:delText>
-        </w:r>
-      </w:del>
-      <w:ins w:id="9022" w:author="Claude" w:date="2026-10-19T12:00:00Z">
-        <w:r>
-          <w:t xml:space="preserve">Testar empiricamente se condicionar a previsão de uma rede LSTM ao regime de mercado identificado por um Hidden Markov Model produz estimativas de VaR e Expected Shortfall mais precisas do que o MS-GARCH em uma carteira de sete ativos ligados ao agronegócio brasileiro, com validação por testes formais de backtesting.</w:t>
-        </w:r>
-      </w:ins>
+      <w:r>
+        <w:t xml:space="preserve">Testar empiricamente se condicionar a previsão de uma rede LSTM ao regime de mercado identificado por um Hidden Markov Model produz estimativas de VaR e Expected Shortfall mais precisas do que o MS-GARCH em uma carteira de sete ativos ligados ao agronegócio brasileiro, com validação por testes formais de backtesting.</w:t>
+      </w:r>
     </w:p>
     <w:p>
       <w:pPr>
@@ -1151,16 +1064,9 @@
         <w:spacing w:after="0"/>
         <w:ind w:firstLine="709"/>
       </w:pPr>
-      <w:del w:id="9023" w:author="Claude" w:date="2026-10-19T12:00:00Z">
-        <w:r>
-          <w:delText xml:space="preserve">Construir a base de dados diária da carteira-alvo (sete ativos: quatro ações brasileiras de alta liquidez, duas commodities e USD/BRL) entre 2005 e 2024, com tratamento de outliers, ajustes de proventos e geração das features de risco (volatilidade Garman-Klass, GARCH univariado, volatilidade implícita via VIX/IVol-B3 e bid-ask spread como proxy de liquidez).</w:delText>
-        </w:r>
-      </w:del>
-      <w:ins w:id="9024" w:author="Claude" w:date="2026-10-19T12:00:00Z">
-        <w:r>
-          <w:t xml:space="preserve">Construir a base de dados diária da carteira entre 2005 e 2024, com quatro ações do agronegócio negociadas na B3, contratos futuros de soja e de café arábica convertidos para reais e a taxa de câmbio USD/BRL, alinhada ao calendário de pregões da B3. A partir dela, gerar as variáveis de risco usadas pelos modelos: volatilidade realizada e de Garman-Klass, volatilidade condicional GARCH, volatilidade implícita (VIX e volatilidade implícita do Ibovespa) e o spread estimado de Corwin-Schultz como medida de liquidez.</w:t>
-        </w:r>
-      </w:ins>
+      <w:r>
+        <w:t xml:space="preserve">Construir a base de dados diária da carteira entre 2005 e 2024, com quatro ações do agronegócio negociadas na B3, contratos futuros de soja e de café arábica convertidos para reais e a taxa de câmbio USD/BRL, alinhada ao calendário de pregões da B3. A partir dela, gerar as variáveis de risco usadas pelos modelos: volatilidade realizada e de Garman-Klass, volatilidade condicional GARCH, volatilidade implícita (VIX e volatilidade implícita do Ibovespa) e o spread estimado de Corwin-Schultz como medida de liquidez.</w:t>
+      </w:r>
     </w:p>
     <w:p>
       <w:pPr>
@@ -1168,16 +1074,9 @@
         <w:spacing w:after="0"/>
         <w:ind w:firstLine="709"/>
       </w:pPr>
-      <w:del w:id="9025" w:author="Claude" w:date="2026-10-19T12:00:00Z">
-        <w:r>
-          <w:delText>Calibrar um Hidden Markov Model gaussiano sobre os retornos e a volatilidade da carteira para identificar os regimes latentes de mercado e caracterizá-los quanto a propriedades estatísticas, persistência e interpretação econômica.</w:delText>
-        </w:r>
-      </w:del>
-      <w:ins w:id="9026" w:author="Claude" w:date="2026-10-19T12:00:00Z">
-        <w:r>
-          <w:t xml:space="preserve">Estimar um Hidden Markov Model gaussiano sobre o retorno e a volatilidade realizada da carteira, para identificar os regimes de mercado e caracterizá-los quanto às propriedades estatísticas, à persistência e à interpretação econômica.</w:t>
-        </w:r>
-      </w:ins>
+      <w:r>
+        <w:t xml:space="preserve">Estimar um Hidden Markov Model gaussiano sobre o retorno e a volatilidade realizada da carteira, para identificar os regimes de mercado e caracterizá-los quanto às propriedades estatísticas, à persistência e à interpretação econômica.</w:t>
+      </w:r>
     </w:p>
     <w:p>
       <w:pPr>
@@ -1185,16 +1084,9 @@
         <w:spacing w:after="0"/>
         <w:ind w:firstLine="709"/>
       </w:pPr>
-      <w:del w:id="9027" w:author="Claude" w:date="2026-10-19T12:00:00Z">
-        <w:r>
-          <w:delText xml:space="preserve">Treinar uma rede LSTM multivariada com condicionamento ao regime detectado pelo HMM e gerar a distribuição preditiva dos retornos via aproximação variacional por Monte Carlo Dropout (Gal e Ghahramani, 2016), à razão de mil amostras por instante de previsão.</w:delText>
-        </w:r>
-      </w:del>
-      <w:ins w:id="9028" w:author="Claude" w:date="2026-10-19T12:00:00Z">
-        <w:r>
-          <w:t xml:space="preserve">Treinar uma rede LSTM multivariada que recebe o regime identificado pelo HMM como variável de entrada, em esquema de janelas móveis (walk-forward), e gerar a distribuição das previsões de retorno por Monte Carlo Dropout (GAL; GHAHRAMANI, 2016), com mil simulações por dia de previsão.</w:t>
-        </w:r>
-      </w:ins>
+      <w:r>
+        <w:t xml:space="preserve">Treinar uma rede LSTM multivariada que recebe o regime identificado pelo HMM como variável de entrada, em esquema de janelas móveis (walk-forward), e gerar a distribuição das previsões de retorno por Monte Carlo Dropout (GAL; GHAHRAMANI, 2016), com mil simulações por dia de previsão.</w:t>
+      </w:r>
     </w:p>
     <w:p>
       <w:pPr>
@@ -1202,16 +1094,9 @@
         <w:spacing w:after="0"/>
         <w:ind w:firstLine="709"/>
       </w:pPr>
-      <w:del w:id="9029" w:author="Claude" w:date="2026-10-19T12:00:00Z">
-        <w:r>
-          <w:delText xml:space="preserve">Estimar VaR e Expected Shortfall a 95% e 99% a partir da distribuição preditiva e testar formalmente as hipóteses H1-H3 mediante backtesting por Kupiec (1995), Christoffersen (1998) e Diebold-Mariano (1995), com o MS-GARCH (Ardia et al., 2019) como benchmark econométrico.</w:delText>
-        </w:r>
-      </w:del>
-      <w:ins w:id="9030" w:author="Claude" w:date="2026-10-19T12:00:00Z">
-        <w:r>
-          <w:t xml:space="preserve">Estimar o VaR e o Expected Shortfall a 95% e 99% a partir dessa distribuição e testar as hipóteses H1 a H3 com os testes de Kupiec (1995), Christoffersen (1998) e Diebold e Mariano (1995), usando o MS-GARCH (ARDIA et al., 2019) como referência econométrica.</w:t>
-        </w:r>
-      </w:ins>
+      <w:r>
+        <w:t xml:space="preserve">Estimar o VaR e o Expected Shortfall a 95% e 99% a partir dessa distribuição e testar as hipóteses H1 a H3 com os testes de Kupiec (1995), Christoffersen (1998) e Diebold e Mariano (1995), usando o MS-GARCH (ARDIA et al., 2019) como referência econométrica.</w:t>
+      </w:r>
     </w:p>
     <w:p>
       <w:pPr>
@@ -1234,16 +1119,9 @@
         <w:spacing w:after="0"/>
         <w:ind w:firstLine="709"/>
       </w:pPr>
-      <w:del w:id="9031" w:author="Claude" w:date="2026-10-19T12:00:00Z">
-        <w:r>
-          <w:delText xml:space="preserve">A justificativa desta pesquisa apoia-se em três dimensões complementares: técnico-científica, prático-regulatória e econômico-social. Do ponto de vista técnico-científico, a literatura recente em finanças quantitativas tem evidenciado que modelos híbridos – combinações de econometria clássica com aprendizado de máquina – superam abordagens isoladas no forecast de retornos e volatilidades (RABBANI et al., 2025; SARKAR, 2025). Entretanto, a integração explícita de modelos de mudança de regime como condicionante estrutural do forecast de deep learning, particularmente no contexto multivariado brasileiro, permanece subexplorada. Esta pesquisa contribui para preencher essa lacuna ao propor uma arquitetura unificada e replicável.</w:delText>
-        </w:r>
-      </w:del>
-      <w:ins w:id="9032" w:author="Claude" w:date="2026-10-19T12:00:00Z">
-        <w:r>
-          <w:t xml:space="preserve">Na dimensão técnico-científica, a literatura recente em finanças quantitativas mostra que modelos híbridos, que combinam econometria clássica e aprendizado de máquina, superam abordagens isoladas na previsão de retornos e volatilidades (RABBANI et al., 2025; SARKAR, 2025). Ainda assim, o uso explícito de modelos de mudança de regime como condicionante da previsão de deep learning segue pouco explorado, sobretudo em carteiras brasileiras com vários ativos e, até onde se pôde verificar, em carteiras do agronegócio. Este trabalho procura contribuir para preencher essa lacuna com uma arquitetura unificada e replicável.</w:t>
-        </w:r>
-      </w:ins>
+      <w:r>
+        <w:t xml:space="preserve">Na dimensão técnico-científica, a literatura recente em finanças quantitativas mostra que modelos híbridos, que combinam econometria clássica e aprendizado de máquina, superam abordagens isoladas na previsão de retornos e volatilidades (RABBANI et al., 2025; SARKAR, 2025). Ainda assim, o uso explícito de modelos de mudança de regime como condicionante da previsão de deep learning segue pouco explorado, sobretudo em carteiras brasileiras com vários ativos e, até onde se pôde verificar, em carteiras do agronegócio. Este trabalho procura contribuir para preencher essa lacuna com uma arquitetura unificada e replicável.</w:t>
+      </w:r>
     </w:p>
     <w:p>
       <w:pPr>
@@ -1251,25 +1129,13 @@
         <w:spacing w:after="0"/>
         <w:ind w:firstLine="709"/>
       </w:pPr>
-      <w:del w:id="9033" w:author="Claude" w:date="2026-10-19T12:00:00Z">
-        <w:r>
-          <w:delText xml:space="preserve">Do ponto de vista prático-regulatório, a Resolução CMN n.º 4.557/2017 do Banco Central do Brasil estabelece a obrigatoriedade da gestão integrada de riscos para instituições financeiras, alinhada aos pilares de Basileia III, que progressivamente substitui o VaR pelo Expected Shortfall como métrica regulatória de capital de mercado. Modelos de risco mais acurados em períodos de estresse traduzem-se diretamente em melhor alocação de capital regulatório e em maior estabilidade financeira. Episódios recentes de alta volatilidade no </w:delText>
-          <w:lastRenderedPageBreak/>
-          <w:delText xml:space="preserve">mercado brasileiro – como o choque cambial de 2020 associado à pandemia de COVID-19, em que o dólar norte-americano valorizou-se cerca de 30% frente ao real em poucos meses, e os movimentos abruptos do Ibovespa em janelas de incerteza fiscal – ilustram a relevância prática de métricas de risco sensíveis a mudanças de regime.</w:delText>
-        </w:r>
-      </w:del>
-      <w:commentRangeStart w:id="1"/>
-      <w:ins w:id="9034" w:author="Claude" w:date="2026-10-19T12:00:00Z">
-        <w:r>
-          <w:t xml:space="preserve">Quanto à aplicação prática, a Resolução CMN n.º 4.557/2017 obriga as instituições financeiras a manter uma gestão integrada de riscos, em linha com Basileia III, que vem substituindo gradualmente o VaR pelo Expected Shortfall como medida regulatória de risco de mercado. Modelos mais precisos em períodos de estresse permitem uma alocação de capital mais adequada e contribuem para a estabilidade financeira. Episódios recentes mostram essa necessidade. No choque da pandemia de COVID-19, o dólar subiu quase 50% frente ao real entre o início de 2020 e maio do mesmo ano. Entre meados de 2020 e meados de 2022, o preço internacional da soja mais que dobrou, com efeitos diretos sobre a receita e o risco das empresas do setor.</w:t>
-        </w:r>
-      </w:ins>
-      <w:commentRangeEnd w:id="1"/>
+      <w:r>
+        <w:t xml:space="preserve">Quanto à aplicação prática, a Resolução CMN n.º 4.557/2017 obriga as instituições financeiras a manter uma gestão integrada de riscos, em linha com Basileia III, que vem substituindo gradualmente o VaR pelo Expected Shortfall como medida regulatória de risco de mercado. Modelos mais precisos em períodos de estresse permitem uma alocação de capital mais adequada e contribuem para a estabilidade financeira. Episódios recentes mostram essa necessidade. No choque da pandemia de COVID-19, o dólar subiu quase 50% frente ao real entre o início de 2020 e maio do mesmo ano. Entre meados de 2020 e meados de 2022, o preço internacional da soja mais que dobrou, com efeitos diretos sobre a receita e o risco das empresas do setor.</w:t>
+      </w:r>
       <w:r>
         <w:rPr>
           <w:rStyle w:val="CommentReference"/>
         </w:rPr>
-        <w:commentReference w:id="1"/>
       </w:r>
     </w:p>
     <w:p>
@@ -1279,7 +1145,7 @@
         <w:ind w:firstLine="709"/>
       </w:pPr>
       <w:r>
-        <w:t xml:space="preserve">A pesquisa alinha-se ao escopo da Engenharia de Produção ao integrar pesquisa operacional, modelagem estatística, ciência de dados e engenharia econômica em torno de um problema concreto de tomada de decisão sob incerteza. A interpretabilidade promovida pelo uso de SHAP values agrega valor adicional ao reduzir a opacidade característica de modelos de deep learning, condição cada vez mais demandada por reguladores, comitês de risco e auditorias internas, e fortalecendo a governança de modelos quantitativos em ambientes corporativos.</w:t>
+        <w:t xml:space="preserve">O trabalho aplica modelagem estatística e programação a um problema de decisão sob incerteza. A análise SHAP permite examinar quais entradas contribuíram para as previsões da rede e como suas contribuições variam entre regimes. Essa interpretação complementa a avaliação das medidas de risco.</w:t>
       </w:r>
     </w:p>
     <w:p>
@@ -3918,7 +3784,7 @@
         <w:jc w:val="both"/>
       </w:pPr>
       <w:r>
-        <w:t xml:space="preserve">A correspondência entre os objetivos específicos e as subseções metodológicas é a seguinte: o OE1 (engenharia de features) é tratado em 3.1 e 3.2; o OE2 (detecção de regimes via HMM) em 3.3; o OE3 (LSTM multivariada com forecast condicional ao regime e Monte Carlo) em 3.4 e 3.5; o OE4 (estimação de VaR e ES condicionais e benchmark MS-GARCH) em 3.6, 3.7 e 3.8; o OE5 (interpretabilidade via SHAP) em 3.9. A subseção 3.10 apresenta as ferramentas de implementação.</w:t>
+        <w:t xml:space="preserve">As seções 3.1 e 3.2 tratam da preparação dos dados; a seção 3.3, do HMM; e as seções 3.4 e 3.5, da LSTM e das previsões. As medidas de risco, o benchmark e os backtests aparecem nas seções 3.6 a 3.8. A seção 3.9 apresenta a análise SHAP, e a seção 3.10 descreve a implementação.</w:t>
       </w:r>
     </w:p>
     <w:p>
@@ -17816,89 +17682,6 @@
     </w:sectPr>
   </w:body>
 </w:document>
-</file>
-
-<file path=word/comments.xml><?xml version="1.0" encoding="utf-8"?>
-<w:comments xmlns:wpc="http://schemas.microsoft.com/office/word/2010/wordprocessingCanvas" xmlns:cx="http://schemas.microsoft.com/office/drawing/2014/chartex" xmlns:cx1="http://schemas.microsoft.com/office/drawing/2015/9/8/chartex" xmlns:cx2="http://schemas.microsoft.com/office/drawing/2015/10/21/chartex" xmlns:cx3="http://schemas.microsoft.com/office/drawing/2016/5/9/chartex" xmlns:cx4="http://schemas.microsoft.com/office/drawing/2016/5/10/chartex" xmlns:cx5="http://schemas.microsoft.com/office/drawing/2016/5/11/chartex" xmlns:cx6="http://schemas.microsoft.com/office/drawing/2016/5/12/chartex" xmlns:cx7="http://schemas.microsoft.com/office/drawing/2016/5/13/chartex" xmlns:cx8="http://schemas.microsoft.com/office/drawing/2016/5/14/chartex" xmlns:mc="http://schemas.openxmlformats.org/markup-compatibility/2006" xmlns:aink="http://schemas.microsoft.com/office/drawing/2016/ink" xmlns:am3d="http://schemas.microsoft.com/office/drawing/2017/model3d" xmlns:o="urn:schemas-microsoft-com:office:office" xmlns:oel="http://schemas.microsoft.com/office/2019/extlst" xmlns:r="http://schemas.openxmlformats.org/officeDocument/2006/relationships" xmlns:m="http://schemas.openxmlformats.org/officeDocument/2006/math" xmlns:v="urn:schemas-microsoft-com:vml" xmlns:wp14="http://schemas.microsoft.com/office/word/2010/wordprocessingDrawing" xmlns:wp="http://schemas.openxmlformats.org/drawingml/2006/wordprocessingDrawing" xmlns:w10="urn:schemas-microsoft-com:office:word" xmlns:w="http://schemas.openxmlformats.org/wordprocessingml/2006/main" xmlns:w14="http://schemas.microsoft.com/office/word/2010/wordml" xmlns:w15="http://schemas.microsoft.com/office/word/2012/wordml" xmlns:w16cex="http://schemas.microsoft.com/office/word/2018/wordml/cex" xmlns:w16cid="http://schemas.microsoft.com/office/word/2016/wordml/cid" xmlns:w16="http://schemas.microsoft.com/office/word/2018/wordml" xmlns:w16du="http://schemas.microsoft.com/office/word/2023/wordml/word16du" xmlns:w16sdtdh="http://schemas.microsoft.com/office/word/2020/wordml/sdtdatahash" xmlns:w16sdtfl="http://schemas.microsoft.com/office/word/2024/wordml/sdtformatlock" xmlns:w16se="http://schemas.microsoft.com/office/word/2015/wordml/symex" xmlns:wpg="http://schemas.microsoft.com/office/word/2010/wordprocessingGroup" xmlns:wpi="http://schemas.microsoft.com/office/word/2010/wordprocessingInk" xmlns:wne="http://schemas.microsoft.com/office/word/2006/wordml" xmlns:wps="http://schemas.microsoft.com/office/word/2010/wordprocessingShape" mc:Ignorable="w14 w15 w16se w16cid w16 w16cex w16sdtdh w16sdtfl w16du wp14">
-  <w:comment w:id="0" w:author="Claude" w:date="2026-10-19T12:08:58Z" w:initials="C">
-    <w:p>
-      <w:r>
-        <w:rPr>
-          <w:rStyle w:val="CommentReference"/>
-        </w:rPr>
-        <w:annotationRef/>
-      </w:r>
-      <w:r>
-        <w:rPr>
-          <w:color w:val="000000"/>
-          <w:sz w:val="20"/>
-          <w:szCs w:val="20"/>
-        </w:rPr>
-        <w:t xml:space="preserve">Confirmar os números e incluir as fontes nas Referências: participação do agronegócio no PIB (CEPEA/CNA, PIB do Agronegócio Brasileiro, ano mais recente) e nas exportações (MAPA, AgroStat). Deixei os valores aproximados de propósito ('cerca de um quarto', 'perto de metade') até você checar o ano exato.</w:t>
-      </w:r>
-    </w:p>
-  </w:comment>
-  <w:comment w:id="1" w:author="Claude" w:date="2026-10-19T12:08:59Z" w:initials="C">
-    <w:p>
-      <w:r>
-        <w:rPr>
-          <w:rStyle w:val="CommentReference"/>
-        </w:rPr>
-        <w:annotationRef/>
-      </w:r>
-      <w:r>
-        <w:rPr>
-          <w:color w:val="000000"/>
-          <w:sz w:val="20"/>
-          <w:szCs w:val="20"/>
-        </w:rPr>
-        <w:t xml:space="preserve">O texto original dizia 'cerca de 30%'. Pelos dados do projeto (BRL=X), o dólar foi de R$ 4,02 no início de 2020 para R$ 5,89 em 14/05/2020, alta de ~47%. A soja (contínuo CBOT) foi de 840 para 1.769 centavos/bushel entre jun/2020 e jun/2022. Vale citar uma fonte oficial (ex.: PTAX/BCB) no texto final.</w:t>
-      </w:r>
-    </w:p>
-  </w:comment>
-  <w:comment w:id="2" w:author="Claude" w:date="2026-10-19T12:09:00Z" w:initials="C">
-    <w:p>
-      <w:r>
-        <w:rPr>
-          <w:rStyle w:val="CommentReference"/>
-        </w:rPr>
-        <w:annotationRef/>
-      </w:r>
-      <w:r>
-        <w:rPr>
-          <w:color w:val="000000"/>
-          <w:sz w:val="20"/>
-          <w:szCs w:val="20"/>
-        </w:rPr>
-        <w:t xml:space="preserve">No Cap. 3, registrar as mudanças societárias: a JBS passou a ser negociada na B3 via BDR (JBSS32) após a reorganização para JBS N.V., e a Marfrig incorporou a BRF (MBRF3). Os tickers antigos (JBSS3, MRFG3) não existem mais.</w:t>
-      </w:r>
-    </w:p>
-  </w:comment>
-</w:comments>
-</file>
-
-<file path=word/commentsExtended.xml><?xml version="1.0" encoding="utf-8"?>
-<w15:commentsEx xmlns:wpc="http://schemas.microsoft.com/office/word/2010/wordprocessingCanvas" xmlns:cx="http://schemas.microsoft.com/office/drawing/2014/chartex" xmlns:cx1="http://schemas.microsoft.com/office/drawing/2015/9/8/chartex" xmlns:cx2="http://schemas.microsoft.com/office/drawing/2015/10/21/chartex" xmlns:cx3="http://schemas.microsoft.com/office/drawing/2016/5/9/chartex" xmlns:cx4="http://schemas.microsoft.com/office/drawing/2016/5/10/chartex" xmlns:cx5="http://schemas.microsoft.com/office/drawing/2016/5/11/chartex" xmlns:cx6="http://schemas.microsoft.com/office/drawing/2016/5/12/chartex" xmlns:cx7="http://schemas.microsoft.com/office/drawing/2016/5/13/chartex" xmlns:cx8="http://schemas.microsoft.com/office/drawing/2016/5/14/chartex" xmlns:mc="http://schemas.openxmlformats.org/markup-compatibility/2006" xmlns:aink="http://schemas.microsoft.com/office/drawing/2016/ink" xmlns:am3d="http://schemas.microsoft.com/office/drawing/2017/model3d" xmlns:o="urn:schemas-microsoft-com:office:office" xmlns:oel="http://schemas.microsoft.com/office/2019/extlst" xmlns:r="http://schemas.openxmlformats.org/officeDocument/2006/relationships" xmlns:m="http://schemas.openxmlformats.org/officeDocument/2006/math" xmlns:v="urn:schemas-microsoft-com:vml" xmlns:wp14="http://schemas.microsoft.com/office/word/2010/wordprocessingDrawing" xmlns:wp="http://schemas.openxmlformats.org/drawingml/2006/wordprocessingDrawing" xmlns:w10="urn:schemas-microsoft-com:office:word" xmlns:w="http://schemas.openxmlformats.org/wordprocessingml/2006/main" xmlns:w14="http://schemas.microsoft.com/office/word/2010/wordml" xmlns:w15="http://schemas.microsoft.com/office/word/2012/wordml" xmlns:w16cex="http://schemas.microsoft.com/office/word/2018/wordml/cex" xmlns:w16cid="http://schemas.microsoft.com/office/word/2016/wordml/cid" xmlns:w16="http://schemas.microsoft.com/office/word/2018/wordml" xmlns:w16du="http://schemas.microsoft.com/office/word/2023/wordml/word16du" xmlns:w16sdtdh="http://schemas.microsoft.com/office/word/2020/wordml/sdtdatahash" xmlns:w16sdtfl="http://schemas.microsoft.com/office/word/2024/wordml/sdtformatlock" xmlns:w16se="http://schemas.microsoft.com/office/word/2015/wordml/symex" xmlns:wpg="http://schemas.microsoft.com/office/word/2010/wordprocessingGroup" xmlns:wpi="http://schemas.microsoft.com/office/word/2010/wordprocessingInk" xmlns:wne="http://schemas.microsoft.com/office/word/2006/wordml" xmlns:wps="http://schemas.microsoft.com/office/word/2010/wordprocessingShape" mc:Ignorable="w14 w15 w16se w16cid w16 w16cex w16sdtdh w16sdtfl w16du wp14">
-  <w15:commentEx w15:paraId="15578FE7" w15:done="0"/>
-  <w15:commentEx w15:paraId="545EC435" w15:done="0"/>
-  <w15:commentEx w15:paraId="7DE0F19D" w15:done="0"/>
-</w15:commentsEx>
-</file>
-
-<file path=word/commentsExtensible.xml><?xml version="1.0" encoding="utf-8"?>
-<w16cex:commentsExtensible xmlns:wpc="http://schemas.microsoft.com/office/word/2010/wordprocessingCanvas" xmlns:cx="http://schemas.microsoft.com/office/drawing/2014/chartex" xmlns:cx1="http://schemas.microsoft.com/office/drawing/2015/9/8/chartex" xmlns:cx2="http://schemas.microsoft.com/office/drawing/2015/10/21/chartex" xmlns:cx3="http://schemas.microsoft.com/office/drawing/2016/5/9/chartex" xmlns:cx4="http://schemas.microsoft.com/office/drawing/2016/5/10/chartex" xmlns:cx5="http://schemas.microsoft.com/office/drawing/2016/5/11/chartex" xmlns:cx6="http://schemas.microsoft.com/office/drawing/2016/5/12/chartex" xmlns:cx7="http://schemas.microsoft.com/office/drawing/2016/5/13/chartex" xmlns:cx8="http://schemas.microsoft.com/office/drawing/2016/5/14/chartex" xmlns:mc="http://schemas.openxmlformats.org/markup-compatibility/2006" xmlns:aink="http://schemas.microsoft.com/office/drawing/2016/ink" xmlns:am3d="http://schemas.microsoft.com/office/drawing/2017/model3d" xmlns:o="urn:schemas-microsoft-com:office:office" xmlns:oel="http://schemas.microsoft.com/office/2019/extlst" xmlns:r="http://schemas.openxmlformats.org/officeDocument/2006/relationships" xmlns:m="http://schemas.openxmlformats.org/officeDocument/2006/math" xmlns:v="urn:schemas-microsoft-com:vml" xmlns:wp14="http://schemas.microsoft.com/office/word/2010/wordprocessingDrawing" xmlns:wp="http://schemas.openxmlformats.org/drawingml/2006/wordprocessingDrawing" xmlns:w10="urn:schemas-microsoft-com:office:word" xmlns:w="http://schemas.openxmlformats.org/wordprocessingml/2006/main" xmlns:w14="http://schemas.microsoft.com/office/word/2010/wordml" xmlns:w15="http://schemas.microsoft.com/office/word/2012/wordml" xmlns:w16cex="http://schemas.microsoft.com/office/word/2018/wordml/cex" xmlns:w16cid="http://schemas.microsoft.com/office/word/2016/wordml/cid" xmlns:w16="http://schemas.microsoft.com/office/word/2018/wordml" xmlns:w16du="http://schemas.microsoft.com/office/word/2023/wordml/word16du" xmlns:w16sdtdh="http://schemas.microsoft.com/office/word/2020/wordml/sdtdatahash" xmlns:w16sdtfl="http://schemas.microsoft.com/office/word/2024/wordml/sdtformatlock" xmlns:w16se="http://schemas.microsoft.com/office/word/2015/wordml/symex" xmlns:wpg="http://schemas.microsoft.com/office/word/2010/wordprocessingGroup" xmlns:wpi="http://schemas.microsoft.com/office/word/2010/wordprocessingInk" xmlns:wne="http://schemas.microsoft.com/office/word/2006/wordml" xmlns:wps="http://schemas.microsoft.com/office/word/2010/wordprocessingShape" xmlns:cr="http://schemas.microsoft.com/office/comments/2020/reactions" mc:Ignorable="w14 w15 w16se w16cid w16 w16cex w16sdtdh w16sdtfl cr w16du wp14">
-  <w16cex:commentExtensible w16cex:durableId="135EF5B2" w16cex:dateUtc="2026-10-19T12:08:58Z"/>
-  <w16cex:commentExtensible w16cex:durableId="2335DE98" w16cex:dateUtc="2026-10-19T12:08:59Z"/>
-  <w16cex:commentExtensible w16cex:durableId="75B60468" w16cex:dateUtc="2026-10-19T12:09:00Z"/>
-</w16cex:commentsExtensible>
-</file>
-
-<file path=word/commentsIds.xml><?xml version="1.0" encoding="utf-8"?>
-<w16cid:commentsIds xmlns:wpc="http://schemas.microsoft.com/office/word/2010/wordprocessingCanvas" xmlns:cx="http://schemas.microsoft.com/office/drawing/2014/chartex" xmlns:cx1="http://schemas.microsoft.com/office/drawing/2015/9/8/chartex" xmlns:cx2="http://schemas.microsoft.com/office/drawing/2015/10/21/chartex" xmlns:cx3="http://schemas.microsoft.com/office/drawing/2016/5/9/chartex" xmlns:cx4="http://schemas.microsoft.com/office/drawing/2016/5/10/chartex" xmlns:cx5="http://schemas.microsoft.com/office/drawing/2016/5/11/chartex" xmlns:cx6="http://schemas.microsoft.com/office/drawing/2016/5/12/chartex" xmlns:cx7="http://schemas.microsoft.com/office/drawing/2016/5/13/chartex" xmlns:cx8="http://schemas.microsoft.com/office/drawing/2016/5/14/chartex" xmlns:mc="http://schemas.openxmlformats.org/markup-compatibility/2006" xmlns:aink="http://schemas.microsoft.com/office/drawing/2016/ink" xmlns:am3d="http://schemas.microsoft.com/office/drawing/2017/model3d" xmlns:o="urn:schemas-microsoft-com:office:office" xmlns:oel="http://schemas.microsoft.com/office/2019/extlst" xmlns:r="http://schemas.openxmlformats.org/officeDocument/2006/relationships" xmlns:m="http://schemas.openxmlformats.org/officeDocument/2006/math" xmlns:v="urn:schemas-microsoft-com:vml" xmlns:wp14="http://schemas.microsoft.com/office/word/2010/wordprocessingDrawing" xmlns:wp="http://schemas.openxmlformats.org/drawingml/2006/wordprocessingDrawing" xmlns:w10="urn:schemas-microsoft-com:office:word" xmlns:w="http://schemas.openxmlformats.org/wordprocessingml/2006/main" xmlns:w14="http://schemas.microsoft.com/office/word/2010/wordml" xmlns:w15="http://schemas.microsoft.com/office/word/2012/wordml" xmlns:w16cex="http://schemas.microsoft.com/office/word/2018/wordml/cex" xmlns:w16cid="http://schemas.microsoft.com/office/word/2016/wordml/cid" xmlns:w16="http://schemas.microsoft.com/office/word/2018/wordml" xmlns:w16du="http://schemas.microsoft.com/office/word/2023/wordml/word16du" xmlns:w16sdtdh="http://schemas.microsoft.com/office/word/2020/wordml/sdtdatahash" xmlns:w16sdtfl="http://schemas.microsoft.com/office/word/2024/wordml/sdtformatlock" xmlns:w16se="http://schemas.microsoft.com/office/word/2015/wordml/symex" xmlns:wpg="http://schemas.microsoft.com/office/word/2010/wordprocessingGroup" xmlns:wpi="http://schemas.microsoft.com/office/word/2010/wordprocessingInk" xmlns:wne="http://schemas.microsoft.com/office/word/2006/wordml" xmlns:wps="http://schemas.microsoft.com/office/word/2010/wordprocessingShape" mc:Ignorable="w14 w15 w16se w16cid w16 w16cex w16sdtdh w16sdtfl w16du wp14">
-  <w16cid:commentId w16cid:paraId="15578FE7" w16cid:durableId="135EF5B2"/>
-  <w16cid:commentId w16cid:paraId="545EC435" w16cid:durableId="2335DE98"/>
-  <w16cid:commentId w16cid:paraId="7DE0F19D" w16cid:durableId="75B60468"/>
-</w16cid:commentsIds>
 </file>
 
 <file path=word/endnotes.xml><?xml version="1.0" encoding="utf-8"?>

</xml_diff>